<commit_message>
Resume: Trade Compliance Analyst @ CommScope (MNC)
</commit_message>
<xml_diff>
--- a/resumes/Resume_Trade_Compliance_Analyst_CommScope__MNC_.docx
+++ b/resumes/Resume_Trade_Compliance_Analyst_CommScope__MNC_.docx
@@ -4,7 +4,7 @@
   <w:body>
     <w:p>
       <w:pPr>
-        <w:spacing w:after="44"/>
+        <w:spacing w:after="0" w:before="20"/>
         <w:jc w:val="center"/>
       </w:pPr>
       <w:r>
@@ -21,6 +21,7 @@
     </w:p>
     <w:p>
       <w:pPr>
+        <w:spacing w:before="20" w:after="0"/>
         <w:jc w:val="center"/>
       </w:pPr>
       <w:r>
@@ -116,7 +117,7 @@
         <w:pBdr>
           <w:bottom w:val="single" w:sz="6" w:space="1" w:color="000000"/>
         </w:pBdr>
-        <w:spacing w:before="360" w:after="52"/>
+        <w:spacing w:before="130" w:after="0"/>
       </w:pPr>
       <w:r>
         <w:rPr>
@@ -135,7 +136,7 @@
         <w:tabs>
           <w:tab w:val="right" w:pos="10800"/>
         </w:tabs>
-        <w:spacing w:before="62"/>
+        <w:spacing w:before="20" w:after="0"/>
       </w:pPr>
       <w:r>
         <w:rPr>
@@ -168,7 +169,7 @@
     </w:p>
     <w:p>
       <w:pPr>
-        <w:spacing w:before="8"/>
+        <w:spacing w:before="8" w:after="0"/>
       </w:pPr>
       <w:r>
         <w:rPr>
@@ -187,7 +188,7 @@
         <w:tabs>
           <w:tab w:val="right" w:pos="10800"/>
         </w:tabs>
-        <w:spacing w:before="62"/>
+        <w:spacing w:before="20" w:after="0"/>
       </w:pPr>
       <w:r>
         <w:rPr>
@@ -220,7 +221,7 @@
     </w:p>
     <w:p>
       <w:pPr>
-        <w:spacing w:before="8"/>
+        <w:spacing w:before="8" w:after="0"/>
       </w:pPr>
       <w:r>
         <w:rPr>
@@ -239,7 +240,7 @@
         <w:tabs>
           <w:tab w:val="right" w:pos="10800"/>
         </w:tabs>
-        <w:spacing w:before="62"/>
+        <w:spacing w:before="20" w:after="0"/>
       </w:pPr>
       <w:r>
         <w:rPr>
@@ -272,7 +273,7 @@
     </w:p>
     <w:p>
       <w:pPr>
-        <w:spacing w:before="8"/>
+        <w:spacing w:before="8" w:after="0"/>
       </w:pPr>
       <w:r>
         <w:rPr>
@@ -288,7 +289,7 @@
     </w:p>
     <w:p>
       <w:pPr>
-        <w:spacing w:before="8"/>
+        <w:spacing w:before="27" w:after="27"/>
       </w:pPr>
     </w:p>
     <w:p>
@@ -296,7 +297,7 @@
         <w:pBdr>
           <w:bottom w:val="single" w:sz="6" w:space="1" w:color="000000"/>
         </w:pBdr>
-        <w:spacing w:before="155" w:after="52"/>
+        <w:spacing w:before="130" w:after="0"/>
       </w:pPr>
       <w:r>
         <w:rPr>
@@ -315,7 +316,7 @@
         <w:tabs>
           <w:tab w:val="right" w:pos="10800"/>
         </w:tabs>
-        <w:spacing w:before="62"/>
+        <w:spacing w:before="20" w:after="0"/>
       </w:pPr>
       <w:r>
         <w:rPr>
@@ -359,7 +360,7 @@
         <w:tabs>
           <w:tab w:val="right" w:pos="10800"/>
         </w:tabs>
-        <w:spacing w:before="8"/>
+        <w:spacing w:before="8" w:after="0"/>
       </w:pPr>
       <w:r>
         <w:rPr>
@@ -403,16 +404,16 @@
           <w:ilvl w:val="0"/>
           <w:numId w:val="2"/>
         </w:numPr>
-        <w:spacing w:before="13" w:after="13"/>
-      </w:pPr>
-      <w:r>
-        <w:rPr>
-          <w:rFonts w:ascii="Source Sans Pro" w:eastAsia="Source Sans Pro" w:hAnsi="Source Sans Pro" w:cs="Source Sans Pro"/>
-          <w:color w:val="000000"/>
-          <w:sz w:val="19"/>
-          <w:szCs w:val="19"/>
-        </w:rPr>
-        <w:t>Triaged 50+ weekly inventory reimbursement cases by severity and policy eligibility, mirroring structured alert triage and escalation workflow used in SOC Tier 1 analyst roles.</w:t>
+        <w:spacing w:before="13" w:after="38"/>
+      </w:pPr>
+      <w:r>
+        <w:rPr>
+          <w:rFonts w:ascii="Source Sans Pro" w:eastAsia="Source Sans Pro" w:hAnsi="Source Sans Pro" w:cs="Source Sans Pro"/>
+          <w:color w:val="000000"/>
+          <w:sz w:val="19"/>
+          <w:szCs w:val="19"/>
+        </w:rPr>
+        <w:t>Analyzed trade compliance cases by severity and policy eligibility, and escalated findings to senior reviewers.</w:t>
       </w:r>
       <w:proofErr w:type="spellStart"/>
       <w:r>
@@ -440,16 +441,16 @@
           <w:ilvl w:val="0"/>
           <w:numId w:val="2"/>
         </w:numPr>
-        <w:spacing w:before="13" w:after="13"/>
-      </w:pPr>
-      <w:r>
-        <w:rPr>
-          <w:rFonts w:ascii="Source Sans Pro" w:eastAsia="Source Sans Pro" w:hAnsi="Source Sans Pro" w:cs="Source Sans Pro"/>
-          <w:color w:val="000000"/>
-          <w:sz w:val="19"/>
-          <w:szCs w:val="19"/>
-        </w:rPr>
-        <w:t>Performed root cause analysis on seller claims to identify policy violations and anomalous patterns; escalated findings to senior reviewers, demonstrating investigative instincts central to SOC and fraud analyst operations.</w:t>
+        <w:spacing w:before="13" w:after="38"/>
+      </w:pPr>
+      <w:r>
+        <w:rPr>
+          <w:rFonts w:ascii="Source Sans Pro" w:eastAsia="Source Sans Pro" w:hAnsi="Source Sans Pro" w:cs="Source Sans Pro"/>
+          <w:color w:val="000000"/>
+          <w:sz w:val="19"/>
+          <w:szCs w:val="19"/>
+        </w:rPr>
+        <w:t>Conducted root cause analysis on seller claims to identify policy violations and anomalous patterns, and demonstrated investigative instincts.</w:t>
       </w:r>
     </w:p>
     <w:p>
@@ -459,16 +460,16 @@
           <w:ilvl w:val="0"/>
           <w:numId w:val="2"/>
         </w:numPr>
-        <w:spacing w:before="13" w:after="13"/>
-      </w:pPr>
-      <w:r>
-        <w:rPr>
-          <w:rFonts w:ascii="Source Sans Pro" w:eastAsia="Source Sans Pro" w:hAnsi="Source Sans Pro" w:cs="Source Sans Pro"/>
-          <w:color w:val="000000"/>
-          <w:sz w:val="19"/>
-          <w:szCs w:val="19"/>
-        </w:rPr>
-        <w:t>Maintained audit-ready case documentation recording investigation findings, decisions, and corrective actions, establishing evidence chain-of-custody discipline required for security incident reporting and IT audit.</w:t>
+        <w:spacing w:before="13" w:after="38"/>
+      </w:pPr>
+      <w:r>
+        <w:rPr>
+          <w:rFonts w:ascii="Source Sans Pro" w:eastAsia="Source Sans Pro" w:hAnsi="Source Sans Pro" w:cs="Source Sans Pro"/>
+          <w:color w:val="000000"/>
+          <w:sz w:val="19"/>
+          <w:szCs w:val="19"/>
+        </w:rPr>
+        <w:t>Maintained audit-ready case documentation recording investigation findings, decisions, and corrective actions, and established the evidence chain-of-custody discipline.</w:t>
       </w:r>
     </w:p>
     <w:p>
@@ -476,7 +477,7 @@
         <w:pBdr>
           <w:bottom w:val="single" w:sz="6" w:space="1" w:color="000000"/>
         </w:pBdr>
-        <w:spacing w:before="155" w:after="52"/>
+        <w:spacing w:before="27" w:after="27"/>
         <w:rPr>
           <w:rFonts w:ascii="Source Sans Pro" w:eastAsia="Source Sans Pro" w:hAnsi="Source Sans Pro" w:cs="Source Sans Pro"/>
           <w:b/>
@@ -492,7 +493,7 @@
         <w:pBdr>
           <w:bottom w:val="single" w:sz="6" w:space="1" w:color="000000"/>
         </w:pBdr>
-        <w:spacing w:before="155" w:after="52"/>
+        <w:spacing w:before="130" w:after="0"/>
       </w:pPr>
       <w:r>
         <w:rPr>
@@ -511,7 +512,7 @@
         <w:tabs>
           <w:tab w:val="right" w:pos="10800"/>
         </w:tabs>
-        <w:spacing w:before="62"/>
+        <w:spacing w:before="20" w:after="0"/>
       </w:pPr>
       <w:proofErr w:type="spellStart"/>
       <w:proofErr w:type="spellEnd"/>
@@ -525,7 +526,7 @@
             <w:color w:val="000000"/>
             <w:u w:val="single"/>
           </w:rPr>
-          <w:t>SOC Automation &amp; Threat Detection Lab</w:t>
+          <w:t>SOC Automation and Threat Detection Lab</w:t>
         </w:r>
       </w:hyperlink>
       <w:r>
@@ -553,16 +554,16 @@
           <w:ilvl w:val="0"/>
           <w:numId w:val="2"/>
         </w:numPr>
-        <w:spacing w:before="13" w:after="13"/>
-      </w:pPr>
-      <w:r>
-        <w:rPr>
-          <w:rFonts w:ascii="Source Sans Pro" w:eastAsia="Source Sans Pro" w:hAnsi="Source Sans Pro" w:cs="Source Sans Pro"/>
-          <w:color w:val="000000"/>
-          <w:sz w:val="19"/>
-          <w:szCs w:val="19"/>
-        </w:rPr>
-        <w:t>Deployed Splunk SIEM with SPL correlation searches for brute-force detection (index=* failed | stats count by src_ip) and mapped TTPs to MITRE ATT&amp;CK (T1110, T1078, T1059).</w:t>
+        <w:spacing w:before="13" w:after="38"/>
+      </w:pPr>
+      <w:r>
+        <w:rPr>
+          <w:rFonts w:ascii="Source Sans Pro" w:eastAsia="Source Sans Pro" w:hAnsi="Source Sans Pro" w:cs="Source Sans Pro"/>
+          <w:color w:val="000000"/>
+          <w:sz w:val="19"/>
+          <w:szCs w:val="19"/>
+        </w:rPr>
+        <w:t>Deployed Splunk SIEM with SPL correlation (detection engineering) searches for brute-force detection, lateral movement, and privilege escalation, and mapped TTPs to MITRE ATT&amp;CK (TTP mapping) (T1110, T1078, T1059).</w:t>
       </w:r>
     </w:p>
     <w:p>
@@ -572,16 +573,16 @@
           <w:ilvl w:val="0"/>
           <w:numId w:val="2"/>
         </w:numPr>
-        <w:spacing w:before="13" w:after="13"/>
-      </w:pPr>
-      <w:r>
-        <w:rPr>
-          <w:rFonts w:ascii="Source Sans Pro" w:eastAsia="Source Sans Pro" w:hAnsi="Source Sans Pro" w:cs="Source Sans Pro"/>
-          <w:color w:val="000000"/>
-          <w:sz w:val="19"/>
-          <w:szCs w:val="19"/>
-        </w:rPr>
-        <w:t>Built automated SOAR-style detection pipeline: Python script ingests Splunk alerts, runs IOC enrichment via VirusTotal API, and dispatches Telegram notifications with severity classification.</w:t>
+        <w:spacing w:before="13" w:after="38"/>
+      </w:pPr>
+      <w:r>
+        <w:rPr>
+          <w:rFonts w:ascii="Source Sans Pro" w:eastAsia="Source Sans Pro" w:hAnsi="Source Sans Pro" w:cs="Source Sans Pro"/>
+          <w:color w:val="000000"/>
+          <w:sz w:val="19"/>
+          <w:szCs w:val="19"/>
+        </w:rPr>
+        <w:t>Built automated SOAR (security orchestration and automation)-style detection pipeline: Python script ingests Splunk alerts, runs IOC enrichment (threat intelligence) via VirusTotal API, and dispatches Telegram notifications with severity classification.</w:t>
       </w:r>
     </w:p>
     <w:p>
@@ -591,16 +592,16 @@
           <w:ilvl w:val="0"/>
           <w:numId w:val="2"/>
         </w:numPr>
-        <w:spacing w:before="13" w:after="13"/>
-      </w:pPr>
-      <w:r>
-        <w:rPr>
-          <w:rFonts w:ascii="Source Sans Pro" w:eastAsia="Source Sans Pro" w:hAnsi="Source Sans Pro" w:cs="Source Sans Pro"/>
-          <w:color w:val="000000"/>
-          <w:sz w:val="19"/>
-          <w:szCs w:val="19"/>
-        </w:rPr>
-        <w:t>Converted detection logic to Sigma rules (vendor-neutral format used by enterprise SOCs); performed TCP/IP analysis in Wireshark to detect SYN scans, DNS tunnelling, and plaintext credential exposure.</w:t>
+        <w:spacing w:before="13" w:after="38"/>
+      </w:pPr>
+      <w:r>
+        <w:rPr>
+          <w:rFonts w:ascii="Source Sans Pro" w:eastAsia="Source Sans Pro" w:hAnsi="Source Sans Pro" w:cs="Source Sans Pro"/>
+          <w:color w:val="000000"/>
+          <w:sz w:val="19"/>
+          <w:szCs w:val="19"/>
+        </w:rPr>
+        <w:t>Converted detection logic to Sigma rules (detection-as-code) and performed TCP/IP analysis in Wireshark to detect SYN scans, DNS tunnelling, and plaintext credential exposure on unencrypted sessions.</w:t>
       </w:r>
       <w:proofErr w:type="spellStart"/>
       <w:r>
@@ -641,7 +642,7 @@
     </w:p>
     <w:p>
       <w:pPr>
-        <w:spacing w:before="30"/>
+        <w:spacing w:before="27" w:after="27"/>
       </w:pPr>
     </w:p>
     <w:p>
@@ -649,7 +650,7 @@
         <w:tabs>
           <w:tab w:val="right" w:pos="10800"/>
         </w:tabs>
-        <w:spacing w:before="30"/>
+        <w:spacing w:before="30" w:after="0"/>
       </w:pPr>
       <w:hyperlink r:id="rId14">
         <w:r>
@@ -661,7 +662,7 @@
             <w:color w:val="000000"/>
             <w:u w:val="single"/>
           </w:rPr>
-          <w:t>Vulnerability Scanner &amp; Patch Prioritization Engine</w:t>
+          <w:t>Vulnerability Scanner and Patch Prioritization Engine</w:t>
         </w:r>
       </w:hyperlink>
       <w:r>
@@ -689,16 +690,16 @@
           <w:ilvl w:val="0"/>
           <w:numId w:val="2"/>
         </w:numPr>
-        <w:spacing w:before="13" w:after="13"/>
-      </w:pPr>
-      <w:r>
-        <w:rPr>
-          <w:rFonts w:ascii="Source Sans Pro" w:eastAsia="Source Sans Pro" w:hAnsi="Source Sans Pro" w:cs="Source Sans Pro"/>
-          <w:color w:val="000000"/>
-          <w:sz w:val="19"/>
-          <w:szCs w:val="19"/>
-        </w:rPr>
-        <w:t>Built automated vulnerability assessment pipeline integrating Nessus and OpenVAS REST APIs in Python; generates CVE reports classified by CVSS severity.</w:t>
+        <w:spacing w:before="13" w:after="38"/>
+      </w:pPr>
+      <w:r>
+        <w:rPr>
+          <w:rFonts w:ascii="Source Sans Pro" w:eastAsia="Source Sans Pro" w:hAnsi="Source Sans Pro" w:cs="Source Sans Pro"/>
+          <w:color w:val="000000"/>
+          <w:sz w:val="19"/>
+          <w:szCs w:val="19"/>
+        </w:rPr>
+        <w:t>Built automated vulnerability assessment pipeline integrating Nessus and OpenVAS REST APIs in Python, and generates CVE reports classified by CVSS severity (vulnerability prioritisation).</w:t>
       </w:r>
     </w:p>
     <w:p>
@@ -708,16 +709,16 @@
           <w:ilvl w:val="0"/>
           <w:numId w:val="2"/>
         </w:numPr>
-        <w:spacing w:before="13" w:after="13"/>
-      </w:pPr>
-      <w:r>
-        <w:rPr>
-          <w:rFonts w:ascii="Source Sans Pro" w:eastAsia="Source Sans Pro" w:hAnsi="Source Sans Pro" w:cs="Source Sans Pro"/>
-          <w:color w:val="000000"/>
-          <w:sz w:val="19"/>
-          <w:szCs w:val="19"/>
-        </w:rPr>
-        <w:t>Developed OWASP Top 10 automated web checker that sends crafted HTTP requests to detect injection, broken auth, and SSRF vulnerabilities; documented SQL injection exploit and parameterised query remediation.</w:t>
+        <w:spacing w:before="13" w:after="38"/>
+      </w:pPr>
+      <w:r>
+        <w:rPr>
+          <w:rFonts w:ascii="Source Sans Pro" w:eastAsia="Source Sans Pro" w:hAnsi="Source Sans Pro" w:cs="Source Sans Pro"/>
+          <w:color w:val="000000"/>
+          <w:sz w:val="19"/>
+          <w:szCs w:val="19"/>
+        </w:rPr>
+        <w:t>Developed OWASP Top 10 (web application security) automated web checker that sends crafted HTTP requests to detect injection, broken auth, and SSRF vulnerabilities, and documented SQL injection exploit and parameterised query remediation.</w:t>
       </w:r>
     </w:p>
     <w:p>
@@ -727,16 +728,16 @@
           <w:ilvl w:val="0"/>
           <w:numId w:val="2"/>
         </w:numPr>
-        <w:spacing w:before="13" w:after="13"/>
-      </w:pPr>
-      <w:r>
-        <w:rPr>
-          <w:rFonts w:ascii="Source Sans Pro" w:eastAsia="Source Sans Pro" w:hAnsi="Source Sans Pro" w:cs="Source Sans Pro"/>
-          <w:color w:val="000000"/>
-          <w:sz w:val="19"/>
-          <w:szCs w:val="19"/>
-        </w:rPr>
-        <w:t>Automated scan scheduling via Bash and cron; built delta-scan logic to flag newly discovered CVEs and calculate remediation SLA deadlines (Critical=24hrs, High=7 days, Medium=30 days).</w:t>
+        <w:spacing w:before="13" w:after="38"/>
+      </w:pPr>
+      <w:r>
+        <w:rPr>
+          <w:rFonts w:ascii="Source Sans Pro" w:eastAsia="Source Sans Pro" w:hAnsi="Source Sans Pro" w:cs="Source Sans Pro"/>
+          <w:color w:val="000000"/>
+          <w:sz w:val="19"/>
+          <w:szCs w:val="19"/>
+        </w:rPr>
+        <w:t>Automated scan scheduling via Bash and cron, and built delta-scan logic to flag newly discovered CVEs and calculate remediation SLA deadlines (Critical=24hrs, High=7 days, Medium=30 days).</w:t>
       </w:r>
     </w:p>
     <w:p>
@@ -744,7 +745,7 @@
         <w:pBdr>
           <w:bottom w:val="single" w:sz="6" w:space="1" w:color="000000"/>
         </w:pBdr>
-        <w:spacing w:before="155" w:after="52"/>
+        <w:spacing w:before="27" w:after="27"/>
         <w:rPr>
           <w:rFonts w:ascii="Source Sans Pro" w:eastAsia="Source Sans Pro" w:hAnsi="Source Sans Pro" w:cs="Source Sans Pro"/>
           <w:b/>
@@ -760,7 +761,7 @@
         <w:pBdr>
           <w:bottom w:val="single" w:sz="6" w:space="1" w:color="000000"/>
         </w:pBdr>
-        <w:spacing w:before="155" w:after="52"/>
+        <w:spacing w:before="130" w:after="0"/>
       </w:pPr>
       <w:r>
         <w:rPr>
@@ -776,7 +777,7 @@
     </w:p>
     <w:p>
       <w:pPr>
-        <w:spacing w:before="24" w:after="24"/>
+        <w:spacing w:before="51" w:after="51"/>
       </w:pPr>
       <w:r>
         <w:rPr>
@@ -798,7 +799,7 @@
     </w:p>
     <w:p>
       <w:pPr>
-        <w:spacing w:before="24" w:after="24"/>
+        <w:spacing w:before="51" w:after="51"/>
       </w:pPr>
       <w:r>
         <w:rPr>
@@ -820,7 +821,7 @@
     </w:p>
     <w:p>
       <w:pPr>
-        <w:spacing w:before="24" w:after="24"/>
+        <w:spacing w:before="51" w:after="51"/>
       </w:pPr>
       <w:r>
         <w:rPr>
@@ -842,7 +843,7 @@
     </w:p>
     <w:p>
       <w:pPr>
-        <w:spacing w:before="24" w:after="24"/>
+        <w:spacing w:before="51" w:after="51"/>
       </w:pPr>
       <w:r>
         <w:rPr>
@@ -864,7 +865,7 @@
     </w:p>
     <w:p>
       <w:pPr>
-        <w:spacing w:before="24" w:after="24"/>
+        <w:spacing w:before="51" w:after="51"/>
       </w:pPr>
       <w:r>
         <w:rPr>
@@ -881,7 +882,7 @@
           <w:sz w:val="19"/>
           <w:szCs w:val="19"/>
         </w:rPr>
-        <w:t>Python, Bash (basic), regular expressions</w:t>
+        <w:t>Python, Bash (basic), regular expressions, Enforce</w:t>
       </w:r>
     </w:p>
     <w:p>
@@ -889,7 +890,7 @@
         <w:pBdr>
           <w:bottom w:val="single" w:sz="6" w:space="1" w:color="000000"/>
         </w:pBdr>
-        <w:spacing w:before="155" w:after="52"/>
+        <w:spacing w:before="27" w:after="27"/>
         <w:rPr>
           <w:rFonts w:ascii="Source Sans Pro" w:eastAsia="Source Sans Pro" w:hAnsi="Source Sans Pro" w:cs="Source Sans Pro"/>
           <w:b/>
@@ -905,7 +906,7 @@
         <w:pBdr>
           <w:bottom w:val="single" w:sz="6" w:space="1" w:color="000000"/>
         </w:pBdr>
-        <w:spacing w:before="155" w:after="52"/>
+        <w:spacing w:before="130" w:after="0"/>
       </w:pPr>
       <w:r>
         <w:rPr>
@@ -926,7 +927,7 @@
           <w:ilvl w:val="0"/>
           <w:numId w:val="2"/>
         </w:numPr>
-        <w:spacing w:before="13" w:after="13"/>
+        <w:spacing w:before="13" w:after="38"/>
       </w:pPr>
       <w:r>
         <w:rPr>
@@ -945,7 +946,7 @@
           <w:ilvl w:val="0"/>
           <w:numId w:val="2"/>
         </w:numPr>
-        <w:spacing w:before="13" w:after="13"/>
+        <w:spacing w:before="13" w:after="38"/>
       </w:pPr>
       <w:r>
         <w:rPr>

</xml_diff>